<commit_message>
Update the Step 7 template and sample card
Move the pincite into the quoted-or-paraphrased language column, in
parentheses at the end of each passage, and drop the Pincite column. The
Notes column now holds general notes about the authority, and the
Validation column holds any explanation of an "other" result or a
missing citator. Students may upload a Word document or a PDF.

Co-Authored-By: Claude Opus 5.5 <noreply@anthropic.com>
Claude-Session: https://claude.ai/code/session_01G8g4FwHzYQhMXKhFfWqCNn
</commit_message>
<xml_diff>
--- a/materials/files/Step7_AuthorityTable_Template.docx
+++ b/materials/files/Step7_AuthorityTable_Template.docx
@@ -92,7 +92,7 @@
           <w:sz w:val="20"/>
           <w:szCs w:val="20"/>
         </w:rPr>
-        <w:t xml:space="preserve">In the language column of Table 1, you may list more than one passage. Put each passage in its own bullet, with a short explanation of why you would quote or paraphrase it. In the Pincite column, give a pincite for each passage, in the same order, also as bullets.</w:t>
+        <w:t xml:space="preserve">In the language column of Table 1, you may list more than one passage. Put each passage in its own bullet. At the end of each quoted or paraphrased passage, put its pincite (the page or paragraph) in parentheses, for example (at 1238). Then explain briefly why you would quote or paraphrase the passage.</w:t>
       </w:r>
     </w:p>
     <w:p>
@@ -110,7 +110,7 @@
           <w:sz w:val="20"/>
           <w:szCs w:val="20"/>
         </w:rPr>
-        <w:t xml:space="preserve">Save the file as a Word document named Step7_AuthorityTable, and upload it to Canvas. Do not put your name anywhere in the file or in the file name.</w:t>
+        <w:t xml:space="preserve">Save the file as a Word document or a PDF named Step7_AuthorityTable, and upload it to Canvas. Do not put your name anywhere in the file or in the file name.</w:t>
       </w:r>
     </w:p>
     <w:p>
@@ -135,15 +135,14 @@
         </w:tblBorders>
       </w:tblPr>
       <w:tblGrid>
-        <w:gridCol w:w="1500"/>
-        <w:gridCol w:w="1500"/>
-        <w:gridCol w:w="1500"/>
-        <w:gridCol w:w="1500"/>
-        <w:gridCol w:w="1600"/>
-        <w:gridCol w:w="2300"/>
-        <w:gridCol w:w="1300"/>
         <w:gridCol w:w="1600"/>
         <w:gridCol w:w="1600"/>
+        <w:gridCol w:w="1600"/>
+        <w:gridCol w:w="1600"/>
+        <w:gridCol w:w="1800"/>
+        <w:gridCol w:w="2800"/>
+        <w:gridCol w:w="1700"/>
+        <w:gridCol w:w="1700"/>
       </w:tblGrid>
       <w:tr>
         <w:trPr>
@@ -151,7 +150,7 @@
         </w:trPr>
         <w:tc>
           <w:tcPr>
-            <w:tcW w:type="dxa" w:w="1500"/>
+            <w:tcW w:type="dxa" w:w="1600"/>
             <w:tcBorders>
               <w:top w:val="single" w:color="8FA6C1" w:sz="4"/>
               <w:left w:val="single" w:color="8FA6C1" w:sz="4"/>
@@ -183,7 +182,7 @@
         </w:tc>
         <w:tc>
           <w:tcPr>
-            <w:tcW w:type="dxa" w:w="1500"/>
+            <w:tcW w:type="dxa" w:w="1600"/>
             <w:tcBorders>
               <w:top w:val="single" w:color="8FA6C1" w:sz="4"/>
               <w:left w:val="single" w:color="8FA6C1" w:sz="4"/>
@@ -215,7 +214,7 @@
         </w:tc>
         <w:tc>
           <w:tcPr>
-            <w:tcW w:type="dxa" w:w="1500"/>
+            <w:tcW w:type="dxa" w:w="1600"/>
             <w:tcBorders>
               <w:top w:val="single" w:color="8FA6C1" w:sz="4"/>
               <w:left w:val="single" w:color="8FA6C1" w:sz="4"/>
@@ -247,7 +246,7 @@
         </w:tc>
         <w:tc>
           <w:tcPr>
-            <w:tcW w:type="dxa" w:w="1500"/>
+            <w:tcW w:type="dxa" w:w="1600"/>
             <w:tcBorders>
               <w:top w:val="single" w:color="8FA6C1" w:sz="4"/>
               <w:left w:val="single" w:color="8FA6C1" w:sz="4"/>
@@ -279,7 +278,7 @@
         </w:tc>
         <w:tc>
           <w:tcPr>
-            <w:tcW w:type="dxa" w:w="1600"/>
+            <w:tcW w:type="dxa" w:w="1800"/>
             <w:tcBorders>
               <w:top w:val="single" w:color="8FA6C1" w:sz="4"/>
               <w:left w:val="single" w:color="8FA6C1" w:sz="4"/>
@@ -311,7 +310,7 @@
         </w:tc>
         <w:tc>
           <w:tcPr>
-            <w:tcW w:type="dxa" w:w="2300"/>
+            <w:tcW w:type="dxa" w:w="2800"/>
             <w:tcBorders>
               <w:top w:val="single" w:color="8FA6C1" w:sz="4"/>
               <w:left w:val="single" w:color="8FA6C1" w:sz="4"/>
@@ -343,7 +342,7 @@
         </w:tc>
         <w:tc>
           <w:tcPr>
-            <w:tcW w:type="dxa" w:w="1300"/>
+            <w:tcW w:type="dxa" w:w="1700"/>
             <w:tcBorders>
               <w:top w:val="single" w:color="8FA6C1" w:sz="4"/>
               <w:left w:val="single" w:color="8FA6C1" w:sz="4"/>
@@ -369,45 +368,13 @@
                 <w:sz w:val="18"/>
                 <w:szCs w:val="18"/>
               </w:rPr>
-              <w:t xml:space="preserve">Pincite</w:t>
-            </w:r>
-          </w:p>
-        </w:tc>
-        <w:tc>
-          <w:tcPr>
-            <w:tcW w:type="dxa" w:w="1600"/>
-            <w:tcBorders>
-              <w:top w:val="single" w:color="8FA6C1" w:sz="4"/>
-              <w:left w:val="single" w:color="8FA6C1" w:sz="4"/>
-              <w:bottom w:val="single" w:color="8FA6C1" w:sz="4"/>
-              <w:right w:val="single" w:color="8FA6C1" w:sz="4"/>
-            </w:tcBorders>
-            <w:shd w:fill="001E44" w:color="auto" w:val="clear"/>
-            <w:tcMar>
-              <w:top w:type="dxa" w:w="60"/>
-              <w:left w:type="dxa" w:w="80"/>
-              <w:bottom w:type="dxa" w:w="60"/>
-              <w:right w:type="dxa" w:w="80"/>
-            </w:tcMar>
-            <w:vAlign w:val="bottom"/>
-          </w:tcPr>
-          <w:p>
-            <w:r>
-              <w:rPr>
-                <w:rFonts w:ascii="Arial" w:cs="Arial" w:eastAsia="Arial" w:hAnsi="Arial"/>
-                <w:b/>
-                <w:bCs/>
-                <w:color w:val="FFFFFF"/>
-                <w:sz w:val="18"/>
-                <w:szCs w:val="18"/>
-              </w:rPr>
               <w:t xml:space="preserve">Validation</w:t>
             </w:r>
           </w:p>
         </w:tc>
         <w:tc>
           <w:tcPr>
-            <w:tcW w:type="dxa" w:w="1600"/>
+            <w:tcW w:type="dxa" w:w="1700"/>
             <w:tcBorders>
               <w:top w:val="single" w:color="8FA6C1" w:sz="4"/>
               <w:left w:val="single" w:color="8FA6C1" w:sz="4"/>
@@ -444,7 +411,7 @@
         </w:trPr>
         <w:tc>
           <w:tcPr>
-            <w:tcW w:type="dxa" w:w="1500"/>
+            <w:tcW w:type="dxa" w:w="1600"/>
             <w:tcBorders>
               <w:top w:val="single" w:color="8FA6C1" w:sz="4"/>
               <w:left w:val="single" w:color="8FA6C1" w:sz="4"/>
@@ -475,7 +442,7 @@
         </w:tc>
         <w:tc>
           <w:tcPr>
-            <w:tcW w:type="dxa" w:w="1500"/>
+            <w:tcW w:type="dxa" w:w="1600"/>
             <w:tcBorders>
               <w:top w:val="single" w:color="8FA6C1" w:sz="4"/>
               <w:left w:val="single" w:color="8FA6C1" w:sz="4"/>
@@ -506,7 +473,7 @@
         </w:tc>
         <w:tc>
           <w:tcPr>
-            <w:tcW w:type="dxa" w:w="1500"/>
+            <w:tcW w:type="dxa" w:w="1600"/>
             <w:tcBorders>
               <w:top w:val="single" w:color="8FA6C1" w:sz="4"/>
               <w:left w:val="single" w:color="8FA6C1" w:sz="4"/>
@@ -537,7 +504,7 @@
         </w:tc>
         <w:tc>
           <w:tcPr>
-            <w:tcW w:type="dxa" w:w="1500"/>
+            <w:tcW w:type="dxa" w:w="1600"/>
             <w:tcBorders>
               <w:top w:val="single" w:color="8FA6C1" w:sz="4"/>
               <w:left w:val="single" w:color="8FA6C1" w:sz="4"/>
@@ -568,7 +535,7 @@
         </w:tc>
         <w:tc>
           <w:tcPr>
-            <w:tcW w:type="dxa" w:w="1600"/>
+            <w:tcW w:type="dxa" w:w="1800"/>
             <w:tcBorders>
               <w:top w:val="single" w:color="8FA6C1" w:sz="4"/>
               <w:left w:val="single" w:color="8FA6C1" w:sz="4"/>
@@ -599,7 +566,7 @@
         </w:tc>
         <w:tc>
           <w:tcPr>
-            <w:tcW w:type="dxa" w:w="2300"/>
+            <w:tcW w:type="dxa" w:w="2800"/>
             <w:tcBorders>
               <w:top w:val="single" w:color="8FA6C1" w:sz="4"/>
               <w:left w:val="single" w:color="8FA6C1" w:sz="4"/>
@@ -631,7 +598,7 @@
                 <w:sz w:val="18"/>
                 <w:szCs w:val="18"/>
               </w:rPr>
-              <w:t xml:space="preserve">First passage that you would quote or paraphrase, and why it helps your analysis</w:t>
+              <w:t xml:space="preserve">First passage that you would quote or paraphrase, with its pincite in parentheses at the end, for example (at 1238), and why it helps your analysis</w:t>
             </w:r>
           </w:p>
           <w:p>
@@ -651,35 +618,28 @@
                 <w:sz w:val="18"/>
                 <w:szCs w:val="18"/>
               </w:rPr>
-              <w:t xml:space="preserve">Second passage, if you use one, and why</w:t>
-            </w:r>
-          </w:p>
-        </w:tc>
-        <w:tc>
-          <w:tcPr>
-            <w:tcW w:type="dxa" w:w="1300"/>
-            <w:tcBorders>
-              <w:top w:val="single" w:color="8FA6C1" w:sz="4"/>
-              <w:left w:val="single" w:color="8FA6C1" w:sz="4"/>
-              <w:bottom w:val="single" w:color="8FA6C1" w:sz="4"/>
-              <w:right w:val="single" w:color="8FA6C1" w:sz="4"/>
-            </w:tcBorders>
-            <w:tcMar>
-              <w:top w:type="dxa" w:w="60"/>
-              <w:left w:type="dxa" w:w="80"/>
-              <w:bottom w:type="dxa" w:w="60"/>
-              <w:right w:type="dxa" w:w="80"/>
-            </w:tcMar>
-            <w:vAlign w:val="top"/>
-          </w:tcPr>
-          <w:p>
-            <w:pPr>
-              <w:pStyle w:val="ListParagraph"/>
-              <w:numPr>
-                <w:ilvl w:val="0"/>
-                <w:numId w:val="3"/>
-              </w:numPr>
-            </w:pPr>
+              <w:t xml:space="preserve">Second passage, if you use one, with its pincite in parentheses, and why</w:t>
+            </w:r>
+          </w:p>
+        </w:tc>
+        <w:tc>
+          <w:tcPr>
+            <w:tcW w:type="dxa" w:w="1700"/>
+            <w:tcBorders>
+              <w:top w:val="single" w:color="8FA6C1" w:sz="4"/>
+              <w:left w:val="single" w:color="8FA6C1" w:sz="4"/>
+              <w:bottom w:val="single" w:color="8FA6C1" w:sz="4"/>
+              <w:right w:val="single" w:color="8FA6C1" w:sz="4"/>
+            </w:tcBorders>
+            <w:tcMar>
+              <w:top w:type="dxa" w:w="60"/>
+              <w:left w:type="dxa" w:w="80"/>
+              <w:bottom w:type="dxa" w:w="60"/>
+              <w:right w:type="dxa" w:w="80"/>
+            </w:tcMar>
+            <w:vAlign w:val="top"/>
+          </w:tcPr>
+          <w:p>
             <w:r>
               <w:rPr>
                 <w:rFonts w:ascii="Arial" w:cs="Arial" w:eastAsia="Arial" w:hAnsi="Arial"/>
@@ -689,17 +649,28 @@
                 <w:sz w:val="18"/>
                 <w:szCs w:val="18"/>
               </w:rPr>
-              <w:t xml:space="preserve">First pincite</w:t>
-            </w:r>
-          </w:p>
-          <w:p>
-            <w:pPr>
-              <w:pStyle w:val="ListParagraph"/>
-              <w:numPr>
-                <w:ilvl w:val="0"/>
-                <w:numId w:val="3"/>
-              </w:numPr>
-            </w:pPr>
+              <w:t xml:space="preserve">The citator and the result (see below)</w:t>
+            </w:r>
+          </w:p>
+        </w:tc>
+        <w:tc>
+          <w:tcPr>
+            <w:tcW w:type="dxa" w:w="1700"/>
+            <w:tcBorders>
+              <w:top w:val="single" w:color="8FA6C1" w:sz="4"/>
+              <w:left w:val="single" w:color="8FA6C1" w:sz="4"/>
+              <w:bottom w:val="single" w:color="8FA6C1" w:sz="4"/>
+              <w:right w:val="single" w:color="8FA6C1" w:sz="4"/>
+            </w:tcBorders>
+            <w:tcMar>
+              <w:top w:type="dxa" w:w="60"/>
+              <w:left w:type="dxa" w:w="80"/>
+              <w:bottom w:type="dxa" w:w="60"/>
+              <w:right w:type="dxa" w:w="80"/>
+            </w:tcMar>
+            <w:vAlign w:val="top"/>
+          </w:tcPr>
+          <w:p>
             <w:r>
               <w:rPr>
                 <w:rFonts w:ascii="Arial" w:cs="Arial" w:eastAsia="Arial" w:hAnsi="Arial"/>
@@ -709,69 +680,7 @@
                 <w:sz w:val="18"/>
                 <w:szCs w:val="18"/>
               </w:rPr>
-              <w:t xml:space="preserve">Second pincite</w:t>
-            </w:r>
-          </w:p>
-        </w:tc>
-        <w:tc>
-          <w:tcPr>
-            <w:tcW w:type="dxa" w:w="1600"/>
-            <w:tcBorders>
-              <w:top w:val="single" w:color="8FA6C1" w:sz="4"/>
-              <w:left w:val="single" w:color="8FA6C1" w:sz="4"/>
-              <w:bottom w:val="single" w:color="8FA6C1" w:sz="4"/>
-              <w:right w:val="single" w:color="8FA6C1" w:sz="4"/>
-            </w:tcBorders>
-            <w:tcMar>
-              <w:top w:type="dxa" w:w="60"/>
-              <w:left w:type="dxa" w:w="80"/>
-              <w:bottom w:type="dxa" w:w="60"/>
-              <w:right w:type="dxa" w:w="80"/>
-            </w:tcMar>
-            <w:vAlign w:val="top"/>
-          </w:tcPr>
-          <w:p>
-            <w:r>
-              <w:rPr>
-                <w:rFonts w:ascii="Arial" w:cs="Arial" w:eastAsia="Arial" w:hAnsi="Arial"/>
-                <w:i/>
-                <w:iCs/>
-                <w:color w:val="5B6770"/>
-                <w:sz w:val="18"/>
-                <w:szCs w:val="18"/>
-              </w:rPr>
-              <w:t xml:space="preserve">The citator and the result</w:t>
-            </w:r>
-          </w:p>
-        </w:tc>
-        <w:tc>
-          <w:tcPr>
-            <w:tcW w:type="dxa" w:w="1600"/>
-            <w:tcBorders>
-              <w:top w:val="single" w:color="8FA6C1" w:sz="4"/>
-              <w:left w:val="single" w:color="8FA6C1" w:sz="4"/>
-              <w:bottom w:val="single" w:color="8FA6C1" w:sz="4"/>
-              <w:right w:val="single" w:color="8FA6C1" w:sz="4"/>
-            </w:tcBorders>
-            <w:tcMar>
-              <w:top w:type="dxa" w:w="60"/>
-              <w:left w:type="dxa" w:w="80"/>
-              <w:bottom w:type="dxa" w:w="60"/>
-              <w:right w:type="dxa" w:w="80"/>
-            </w:tcMar>
-            <w:vAlign w:val="top"/>
-          </w:tcPr>
-          <w:p>
-            <w:r>
-              <w:rPr>
-                <w:rFonts w:ascii="Arial" w:cs="Arial" w:eastAsia="Arial" w:hAnsi="Arial"/>
-                <w:i/>
-                <w:iCs/>
-                <w:color w:val="5B6770"/>
-                <w:sz w:val="18"/>
-                <w:szCs w:val="18"/>
-              </w:rPr>
-              <w:t xml:space="preserve">Any notes on the validation (see below)</w:t>
+              <w:t xml:space="preserve">Any notes about the case (optional)</w:t>
             </w:r>
           </w:p>
         </w:tc>
@@ -782,118 +691,6 @@
         </w:trPr>
         <w:tc>
           <w:tcPr>
-            <w:tcW w:type="dxa" w:w="1500"/>
-            <w:tcBorders>
-              <w:top w:val="single" w:color="8FA6C1" w:sz="4"/>
-              <w:left w:val="single" w:color="8FA6C1" w:sz="4"/>
-              <w:bottom w:val="single" w:color="8FA6C1" w:sz="4"/>
-              <w:right w:val="single" w:color="8FA6C1" w:sz="4"/>
-            </w:tcBorders>
-            <w:tcMar>
-              <w:top w:type="dxa" w:w="60"/>
-              <w:left w:type="dxa" w:w="80"/>
-              <w:bottom w:type="dxa" w:w="60"/>
-              <w:right w:type="dxa" w:w="80"/>
-            </w:tcMar>
-            <w:vAlign w:val="top"/>
-          </w:tcPr>
-          <w:p>
-            <w:r>
-              <w:rPr>
-                <w:rFonts w:ascii="Arial" w:cs="Arial" w:eastAsia="Arial" w:hAnsi="Arial"/>
-                <w:sz w:val="18"/>
-                <w:szCs w:val="18"/>
-              </w:rPr>
-              <w:t xml:space="preserve"/>
-            </w:r>
-          </w:p>
-        </w:tc>
-        <w:tc>
-          <w:tcPr>
-            <w:tcW w:type="dxa" w:w="1500"/>
-            <w:tcBorders>
-              <w:top w:val="single" w:color="8FA6C1" w:sz="4"/>
-              <w:left w:val="single" w:color="8FA6C1" w:sz="4"/>
-              <w:bottom w:val="single" w:color="8FA6C1" w:sz="4"/>
-              <w:right w:val="single" w:color="8FA6C1" w:sz="4"/>
-            </w:tcBorders>
-            <w:tcMar>
-              <w:top w:type="dxa" w:w="60"/>
-              <w:left w:type="dxa" w:w="80"/>
-              <w:bottom w:type="dxa" w:w="60"/>
-              <w:right w:type="dxa" w:w="80"/>
-            </w:tcMar>
-            <w:vAlign w:val="top"/>
-          </w:tcPr>
-          <w:p>
-            <w:r>
-              <w:rPr>
-                <w:rFonts w:ascii="Arial" w:cs="Arial" w:eastAsia="Arial" w:hAnsi="Arial"/>
-                <w:sz w:val="18"/>
-                <w:szCs w:val="18"/>
-              </w:rPr>
-              <w:t xml:space="preserve"/>
-            </w:r>
-          </w:p>
-        </w:tc>
-        <w:tc>
-          <w:tcPr>
-            <w:tcW w:type="dxa" w:w="1500"/>
-            <w:tcBorders>
-              <w:top w:val="single" w:color="8FA6C1" w:sz="4"/>
-              <w:left w:val="single" w:color="8FA6C1" w:sz="4"/>
-              <w:bottom w:val="single" w:color="8FA6C1" w:sz="4"/>
-              <w:right w:val="single" w:color="8FA6C1" w:sz="4"/>
-            </w:tcBorders>
-            <w:tcMar>
-              <w:top w:type="dxa" w:w="60"/>
-              <w:left w:type="dxa" w:w="80"/>
-              <w:bottom w:type="dxa" w:w="60"/>
-              <w:right w:type="dxa" w:w="80"/>
-            </w:tcMar>
-            <w:vAlign w:val="top"/>
-          </w:tcPr>
-          <w:p>
-            <w:r>
-              <w:rPr>
-                <w:rFonts w:ascii="Arial" w:cs="Arial" w:eastAsia="Arial" w:hAnsi="Arial"/>
-                <w:sz w:val="18"/>
-                <w:szCs w:val="18"/>
-              </w:rPr>
-              <w:t xml:space="preserve"/>
-            </w:r>
-          </w:p>
-        </w:tc>
-        <w:tc>
-          <w:tcPr>
-            <w:tcW w:type="dxa" w:w="1500"/>
-            <w:tcBorders>
-              <w:top w:val="single" w:color="8FA6C1" w:sz="4"/>
-              <w:left w:val="single" w:color="8FA6C1" w:sz="4"/>
-              <w:bottom w:val="single" w:color="8FA6C1" w:sz="4"/>
-              <w:right w:val="single" w:color="8FA6C1" w:sz="4"/>
-            </w:tcBorders>
-            <w:tcMar>
-              <w:top w:type="dxa" w:w="60"/>
-              <w:left w:type="dxa" w:w="80"/>
-              <w:bottom w:type="dxa" w:w="60"/>
-              <w:right w:type="dxa" w:w="80"/>
-            </w:tcMar>
-            <w:vAlign w:val="top"/>
-          </w:tcPr>
-          <w:p>
-            <w:r>
-              <w:rPr>
-                <w:rFonts w:ascii="Arial" w:cs="Arial" w:eastAsia="Arial" w:hAnsi="Arial"/>
-                <w:sz w:val="18"/>
-                <w:szCs w:val="18"/>
-              </w:rPr>
-              <w:t xml:space="preserve"/>
-            </w:r>
-          </w:p>
-        </w:tc>
-        <w:tc>
-          <w:tcPr>
             <w:tcW w:type="dxa" w:w="1600"/>
             <w:tcBorders>
               <w:top w:val="single" w:color="8FA6C1" w:sz="4"/>
@@ -922,62 +719,6 @@
         </w:tc>
         <w:tc>
           <w:tcPr>
-            <w:tcW w:type="dxa" w:w="2300"/>
-            <w:tcBorders>
-              <w:top w:val="single" w:color="8FA6C1" w:sz="4"/>
-              <w:left w:val="single" w:color="8FA6C1" w:sz="4"/>
-              <w:bottom w:val="single" w:color="8FA6C1" w:sz="4"/>
-              <w:right w:val="single" w:color="8FA6C1" w:sz="4"/>
-            </w:tcBorders>
-            <w:tcMar>
-              <w:top w:type="dxa" w:w="60"/>
-              <w:left w:type="dxa" w:w="80"/>
-              <w:bottom w:type="dxa" w:w="60"/>
-              <w:right w:type="dxa" w:w="80"/>
-            </w:tcMar>
-            <w:vAlign w:val="top"/>
-          </w:tcPr>
-          <w:p>
-            <w:r>
-              <w:rPr>
-                <w:rFonts w:ascii="Arial" w:cs="Arial" w:eastAsia="Arial" w:hAnsi="Arial"/>
-                <w:sz w:val="18"/>
-                <w:szCs w:val="18"/>
-              </w:rPr>
-              <w:t xml:space="preserve"/>
-            </w:r>
-          </w:p>
-        </w:tc>
-        <w:tc>
-          <w:tcPr>
-            <w:tcW w:type="dxa" w:w="1300"/>
-            <w:tcBorders>
-              <w:top w:val="single" w:color="8FA6C1" w:sz="4"/>
-              <w:left w:val="single" w:color="8FA6C1" w:sz="4"/>
-              <w:bottom w:val="single" w:color="8FA6C1" w:sz="4"/>
-              <w:right w:val="single" w:color="8FA6C1" w:sz="4"/>
-            </w:tcBorders>
-            <w:tcMar>
-              <w:top w:type="dxa" w:w="60"/>
-              <w:left w:type="dxa" w:w="80"/>
-              <w:bottom w:type="dxa" w:w="60"/>
-              <w:right w:type="dxa" w:w="80"/>
-            </w:tcMar>
-            <w:vAlign w:val="top"/>
-          </w:tcPr>
-          <w:p>
-            <w:r>
-              <w:rPr>
-                <w:rFonts w:ascii="Arial" w:cs="Arial" w:eastAsia="Arial" w:hAnsi="Arial"/>
-                <w:sz w:val="18"/>
-                <w:szCs w:val="18"/>
-              </w:rPr>
-              <w:t xml:space="preserve"/>
-            </w:r>
-          </w:p>
-        </w:tc>
-        <w:tc>
-          <w:tcPr>
             <w:tcW w:type="dxa" w:w="1600"/>
             <w:tcBorders>
               <w:top w:val="single" w:color="8FA6C1" w:sz="4"/>
@@ -1007,6 +748,146 @@
         <w:tc>
           <w:tcPr>
             <w:tcW w:type="dxa" w:w="1600"/>
+            <w:tcBorders>
+              <w:top w:val="single" w:color="8FA6C1" w:sz="4"/>
+              <w:left w:val="single" w:color="8FA6C1" w:sz="4"/>
+              <w:bottom w:val="single" w:color="8FA6C1" w:sz="4"/>
+              <w:right w:val="single" w:color="8FA6C1" w:sz="4"/>
+            </w:tcBorders>
+            <w:tcMar>
+              <w:top w:type="dxa" w:w="60"/>
+              <w:left w:type="dxa" w:w="80"/>
+              <w:bottom w:type="dxa" w:w="60"/>
+              <w:right w:type="dxa" w:w="80"/>
+            </w:tcMar>
+            <w:vAlign w:val="top"/>
+          </w:tcPr>
+          <w:p>
+            <w:r>
+              <w:rPr>
+                <w:rFonts w:ascii="Arial" w:cs="Arial" w:eastAsia="Arial" w:hAnsi="Arial"/>
+                <w:sz w:val="18"/>
+                <w:szCs w:val="18"/>
+              </w:rPr>
+              <w:t xml:space="preserve"/>
+            </w:r>
+          </w:p>
+        </w:tc>
+        <w:tc>
+          <w:tcPr>
+            <w:tcW w:type="dxa" w:w="1600"/>
+            <w:tcBorders>
+              <w:top w:val="single" w:color="8FA6C1" w:sz="4"/>
+              <w:left w:val="single" w:color="8FA6C1" w:sz="4"/>
+              <w:bottom w:val="single" w:color="8FA6C1" w:sz="4"/>
+              <w:right w:val="single" w:color="8FA6C1" w:sz="4"/>
+            </w:tcBorders>
+            <w:tcMar>
+              <w:top w:type="dxa" w:w="60"/>
+              <w:left w:type="dxa" w:w="80"/>
+              <w:bottom w:type="dxa" w:w="60"/>
+              <w:right w:type="dxa" w:w="80"/>
+            </w:tcMar>
+            <w:vAlign w:val="top"/>
+          </w:tcPr>
+          <w:p>
+            <w:r>
+              <w:rPr>
+                <w:rFonts w:ascii="Arial" w:cs="Arial" w:eastAsia="Arial" w:hAnsi="Arial"/>
+                <w:sz w:val="18"/>
+                <w:szCs w:val="18"/>
+              </w:rPr>
+              <w:t xml:space="preserve"/>
+            </w:r>
+          </w:p>
+        </w:tc>
+        <w:tc>
+          <w:tcPr>
+            <w:tcW w:type="dxa" w:w="1800"/>
+            <w:tcBorders>
+              <w:top w:val="single" w:color="8FA6C1" w:sz="4"/>
+              <w:left w:val="single" w:color="8FA6C1" w:sz="4"/>
+              <w:bottom w:val="single" w:color="8FA6C1" w:sz="4"/>
+              <w:right w:val="single" w:color="8FA6C1" w:sz="4"/>
+            </w:tcBorders>
+            <w:tcMar>
+              <w:top w:type="dxa" w:w="60"/>
+              <w:left w:type="dxa" w:w="80"/>
+              <w:bottom w:type="dxa" w:w="60"/>
+              <w:right w:type="dxa" w:w="80"/>
+            </w:tcMar>
+            <w:vAlign w:val="top"/>
+          </w:tcPr>
+          <w:p>
+            <w:r>
+              <w:rPr>
+                <w:rFonts w:ascii="Arial" w:cs="Arial" w:eastAsia="Arial" w:hAnsi="Arial"/>
+                <w:sz w:val="18"/>
+                <w:szCs w:val="18"/>
+              </w:rPr>
+              <w:t xml:space="preserve"/>
+            </w:r>
+          </w:p>
+        </w:tc>
+        <w:tc>
+          <w:tcPr>
+            <w:tcW w:type="dxa" w:w="2800"/>
+            <w:tcBorders>
+              <w:top w:val="single" w:color="8FA6C1" w:sz="4"/>
+              <w:left w:val="single" w:color="8FA6C1" w:sz="4"/>
+              <w:bottom w:val="single" w:color="8FA6C1" w:sz="4"/>
+              <w:right w:val="single" w:color="8FA6C1" w:sz="4"/>
+            </w:tcBorders>
+            <w:tcMar>
+              <w:top w:type="dxa" w:w="60"/>
+              <w:left w:type="dxa" w:w="80"/>
+              <w:bottom w:type="dxa" w:w="60"/>
+              <w:right w:type="dxa" w:w="80"/>
+            </w:tcMar>
+            <w:vAlign w:val="top"/>
+          </w:tcPr>
+          <w:p>
+            <w:r>
+              <w:rPr>
+                <w:rFonts w:ascii="Arial" w:cs="Arial" w:eastAsia="Arial" w:hAnsi="Arial"/>
+                <w:sz w:val="18"/>
+                <w:szCs w:val="18"/>
+              </w:rPr>
+              <w:t xml:space="preserve"/>
+            </w:r>
+          </w:p>
+        </w:tc>
+        <w:tc>
+          <w:tcPr>
+            <w:tcW w:type="dxa" w:w="1700"/>
+            <w:tcBorders>
+              <w:top w:val="single" w:color="8FA6C1" w:sz="4"/>
+              <w:left w:val="single" w:color="8FA6C1" w:sz="4"/>
+              <w:bottom w:val="single" w:color="8FA6C1" w:sz="4"/>
+              <w:right w:val="single" w:color="8FA6C1" w:sz="4"/>
+            </w:tcBorders>
+            <w:tcMar>
+              <w:top w:type="dxa" w:w="60"/>
+              <w:left w:type="dxa" w:w="80"/>
+              <w:bottom w:type="dxa" w:w="60"/>
+              <w:right w:type="dxa" w:w="80"/>
+            </w:tcMar>
+            <w:vAlign w:val="top"/>
+          </w:tcPr>
+          <w:p>
+            <w:r>
+              <w:rPr>
+                <w:rFonts w:ascii="Arial" w:cs="Arial" w:eastAsia="Arial" w:hAnsi="Arial"/>
+                <w:sz w:val="18"/>
+                <w:szCs w:val="18"/>
+              </w:rPr>
+              <w:t xml:space="preserve"/>
+            </w:r>
+          </w:p>
+        </w:tc>
+        <w:tc>
+          <w:tcPr>
+            <w:tcW w:type="dxa" w:w="1700"/>
             <w:tcBorders>
               <w:top w:val="single" w:color="8FA6C1" w:sz="4"/>
               <w:left w:val="single" w:color="8FA6C1" w:sz="4"/>
@@ -1039,118 +920,6 @@
         </w:trPr>
         <w:tc>
           <w:tcPr>
-            <w:tcW w:type="dxa" w:w="1500"/>
-            <w:tcBorders>
-              <w:top w:val="single" w:color="8FA6C1" w:sz="4"/>
-              <w:left w:val="single" w:color="8FA6C1" w:sz="4"/>
-              <w:bottom w:val="single" w:color="8FA6C1" w:sz="4"/>
-              <w:right w:val="single" w:color="8FA6C1" w:sz="4"/>
-            </w:tcBorders>
-            <w:tcMar>
-              <w:top w:type="dxa" w:w="60"/>
-              <w:left w:type="dxa" w:w="80"/>
-              <w:bottom w:type="dxa" w:w="60"/>
-              <w:right w:type="dxa" w:w="80"/>
-            </w:tcMar>
-            <w:vAlign w:val="top"/>
-          </w:tcPr>
-          <w:p>
-            <w:r>
-              <w:rPr>
-                <w:rFonts w:ascii="Arial" w:cs="Arial" w:eastAsia="Arial" w:hAnsi="Arial"/>
-                <w:sz w:val="18"/>
-                <w:szCs w:val="18"/>
-              </w:rPr>
-              <w:t xml:space="preserve"/>
-            </w:r>
-          </w:p>
-        </w:tc>
-        <w:tc>
-          <w:tcPr>
-            <w:tcW w:type="dxa" w:w="1500"/>
-            <w:tcBorders>
-              <w:top w:val="single" w:color="8FA6C1" w:sz="4"/>
-              <w:left w:val="single" w:color="8FA6C1" w:sz="4"/>
-              <w:bottom w:val="single" w:color="8FA6C1" w:sz="4"/>
-              <w:right w:val="single" w:color="8FA6C1" w:sz="4"/>
-            </w:tcBorders>
-            <w:tcMar>
-              <w:top w:type="dxa" w:w="60"/>
-              <w:left w:type="dxa" w:w="80"/>
-              <w:bottom w:type="dxa" w:w="60"/>
-              <w:right w:type="dxa" w:w="80"/>
-            </w:tcMar>
-            <w:vAlign w:val="top"/>
-          </w:tcPr>
-          <w:p>
-            <w:r>
-              <w:rPr>
-                <w:rFonts w:ascii="Arial" w:cs="Arial" w:eastAsia="Arial" w:hAnsi="Arial"/>
-                <w:sz w:val="18"/>
-                <w:szCs w:val="18"/>
-              </w:rPr>
-              <w:t xml:space="preserve"/>
-            </w:r>
-          </w:p>
-        </w:tc>
-        <w:tc>
-          <w:tcPr>
-            <w:tcW w:type="dxa" w:w="1500"/>
-            <w:tcBorders>
-              <w:top w:val="single" w:color="8FA6C1" w:sz="4"/>
-              <w:left w:val="single" w:color="8FA6C1" w:sz="4"/>
-              <w:bottom w:val="single" w:color="8FA6C1" w:sz="4"/>
-              <w:right w:val="single" w:color="8FA6C1" w:sz="4"/>
-            </w:tcBorders>
-            <w:tcMar>
-              <w:top w:type="dxa" w:w="60"/>
-              <w:left w:type="dxa" w:w="80"/>
-              <w:bottom w:type="dxa" w:w="60"/>
-              <w:right w:type="dxa" w:w="80"/>
-            </w:tcMar>
-            <w:vAlign w:val="top"/>
-          </w:tcPr>
-          <w:p>
-            <w:r>
-              <w:rPr>
-                <w:rFonts w:ascii="Arial" w:cs="Arial" w:eastAsia="Arial" w:hAnsi="Arial"/>
-                <w:sz w:val="18"/>
-                <w:szCs w:val="18"/>
-              </w:rPr>
-              <w:t xml:space="preserve"/>
-            </w:r>
-          </w:p>
-        </w:tc>
-        <w:tc>
-          <w:tcPr>
-            <w:tcW w:type="dxa" w:w="1500"/>
-            <w:tcBorders>
-              <w:top w:val="single" w:color="8FA6C1" w:sz="4"/>
-              <w:left w:val="single" w:color="8FA6C1" w:sz="4"/>
-              <w:bottom w:val="single" w:color="8FA6C1" w:sz="4"/>
-              <w:right w:val="single" w:color="8FA6C1" w:sz="4"/>
-            </w:tcBorders>
-            <w:tcMar>
-              <w:top w:type="dxa" w:w="60"/>
-              <w:left w:type="dxa" w:w="80"/>
-              <w:bottom w:type="dxa" w:w="60"/>
-              <w:right w:type="dxa" w:w="80"/>
-            </w:tcMar>
-            <w:vAlign w:val="top"/>
-          </w:tcPr>
-          <w:p>
-            <w:r>
-              <w:rPr>
-                <w:rFonts w:ascii="Arial" w:cs="Arial" w:eastAsia="Arial" w:hAnsi="Arial"/>
-                <w:sz w:val="18"/>
-                <w:szCs w:val="18"/>
-              </w:rPr>
-              <w:t xml:space="preserve"/>
-            </w:r>
-          </w:p>
-        </w:tc>
-        <w:tc>
-          <w:tcPr>
             <w:tcW w:type="dxa" w:w="1600"/>
             <w:tcBorders>
               <w:top w:val="single" w:color="8FA6C1" w:sz="4"/>
@@ -1179,62 +948,6 @@
         </w:tc>
         <w:tc>
           <w:tcPr>
-            <w:tcW w:type="dxa" w:w="2300"/>
-            <w:tcBorders>
-              <w:top w:val="single" w:color="8FA6C1" w:sz="4"/>
-              <w:left w:val="single" w:color="8FA6C1" w:sz="4"/>
-              <w:bottom w:val="single" w:color="8FA6C1" w:sz="4"/>
-              <w:right w:val="single" w:color="8FA6C1" w:sz="4"/>
-            </w:tcBorders>
-            <w:tcMar>
-              <w:top w:type="dxa" w:w="60"/>
-              <w:left w:type="dxa" w:w="80"/>
-              <w:bottom w:type="dxa" w:w="60"/>
-              <w:right w:type="dxa" w:w="80"/>
-            </w:tcMar>
-            <w:vAlign w:val="top"/>
-          </w:tcPr>
-          <w:p>
-            <w:r>
-              <w:rPr>
-                <w:rFonts w:ascii="Arial" w:cs="Arial" w:eastAsia="Arial" w:hAnsi="Arial"/>
-                <w:sz w:val="18"/>
-                <w:szCs w:val="18"/>
-              </w:rPr>
-              <w:t xml:space="preserve"/>
-            </w:r>
-          </w:p>
-        </w:tc>
-        <w:tc>
-          <w:tcPr>
-            <w:tcW w:type="dxa" w:w="1300"/>
-            <w:tcBorders>
-              <w:top w:val="single" w:color="8FA6C1" w:sz="4"/>
-              <w:left w:val="single" w:color="8FA6C1" w:sz="4"/>
-              <w:bottom w:val="single" w:color="8FA6C1" w:sz="4"/>
-              <w:right w:val="single" w:color="8FA6C1" w:sz="4"/>
-            </w:tcBorders>
-            <w:tcMar>
-              <w:top w:type="dxa" w:w="60"/>
-              <w:left w:type="dxa" w:w="80"/>
-              <w:bottom w:type="dxa" w:w="60"/>
-              <w:right w:type="dxa" w:w="80"/>
-            </w:tcMar>
-            <w:vAlign w:val="top"/>
-          </w:tcPr>
-          <w:p>
-            <w:r>
-              <w:rPr>
-                <w:rFonts w:ascii="Arial" w:cs="Arial" w:eastAsia="Arial" w:hAnsi="Arial"/>
-                <w:sz w:val="18"/>
-                <w:szCs w:val="18"/>
-              </w:rPr>
-              <w:t xml:space="preserve"/>
-            </w:r>
-          </w:p>
-        </w:tc>
-        <w:tc>
-          <w:tcPr>
             <w:tcW w:type="dxa" w:w="1600"/>
             <w:tcBorders>
               <w:top w:val="single" w:color="8FA6C1" w:sz="4"/>
@@ -1264,6 +977,146 @@
         <w:tc>
           <w:tcPr>
             <w:tcW w:type="dxa" w:w="1600"/>
+            <w:tcBorders>
+              <w:top w:val="single" w:color="8FA6C1" w:sz="4"/>
+              <w:left w:val="single" w:color="8FA6C1" w:sz="4"/>
+              <w:bottom w:val="single" w:color="8FA6C1" w:sz="4"/>
+              <w:right w:val="single" w:color="8FA6C1" w:sz="4"/>
+            </w:tcBorders>
+            <w:tcMar>
+              <w:top w:type="dxa" w:w="60"/>
+              <w:left w:type="dxa" w:w="80"/>
+              <w:bottom w:type="dxa" w:w="60"/>
+              <w:right w:type="dxa" w:w="80"/>
+            </w:tcMar>
+            <w:vAlign w:val="top"/>
+          </w:tcPr>
+          <w:p>
+            <w:r>
+              <w:rPr>
+                <w:rFonts w:ascii="Arial" w:cs="Arial" w:eastAsia="Arial" w:hAnsi="Arial"/>
+                <w:sz w:val="18"/>
+                <w:szCs w:val="18"/>
+              </w:rPr>
+              <w:t xml:space="preserve"/>
+            </w:r>
+          </w:p>
+        </w:tc>
+        <w:tc>
+          <w:tcPr>
+            <w:tcW w:type="dxa" w:w="1600"/>
+            <w:tcBorders>
+              <w:top w:val="single" w:color="8FA6C1" w:sz="4"/>
+              <w:left w:val="single" w:color="8FA6C1" w:sz="4"/>
+              <w:bottom w:val="single" w:color="8FA6C1" w:sz="4"/>
+              <w:right w:val="single" w:color="8FA6C1" w:sz="4"/>
+            </w:tcBorders>
+            <w:tcMar>
+              <w:top w:type="dxa" w:w="60"/>
+              <w:left w:type="dxa" w:w="80"/>
+              <w:bottom w:type="dxa" w:w="60"/>
+              <w:right w:type="dxa" w:w="80"/>
+            </w:tcMar>
+            <w:vAlign w:val="top"/>
+          </w:tcPr>
+          <w:p>
+            <w:r>
+              <w:rPr>
+                <w:rFonts w:ascii="Arial" w:cs="Arial" w:eastAsia="Arial" w:hAnsi="Arial"/>
+                <w:sz w:val="18"/>
+                <w:szCs w:val="18"/>
+              </w:rPr>
+              <w:t xml:space="preserve"/>
+            </w:r>
+          </w:p>
+        </w:tc>
+        <w:tc>
+          <w:tcPr>
+            <w:tcW w:type="dxa" w:w="1800"/>
+            <w:tcBorders>
+              <w:top w:val="single" w:color="8FA6C1" w:sz="4"/>
+              <w:left w:val="single" w:color="8FA6C1" w:sz="4"/>
+              <w:bottom w:val="single" w:color="8FA6C1" w:sz="4"/>
+              <w:right w:val="single" w:color="8FA6C1" w:sz="4"/>
+            </w:tcBorders>
+            <w:tcMar>
+              <w:top w:type="dxa" w:w="60"/>
+              <w:left w:type="dxa" w:w="80"/>
+              <w:bottom w:type="dxa" w:w="60"/>
+              <w:right w:type="dxa" w:w="80"/>
+            </w:tcMar>
+            <w:vAlign w:val="top"/>
+          </w:tcPr>
+          <w:p>
+            <w:r>
+              <w:rPr>
+                <w:rFonts w:ascii="Arial" w:cs="Arial" w:eastAsia="Arial" w:hAnsi="Arial"/>
+                <w:sz w:val="18"/>
+                <w:szCs w:val="18"/>
+              </w:rPr>
+              <w:t xml:space="preserve"/>
+            </w:r>
+          </w:p>
+        </w:tc>
+        <w:tc>
+          <w:tcPr>
+            <w:tcW w:type="dxa" w:w="2800"/>
+            <w:tcBorders>
+              <w:top w:val="single" w:color="8FA6C1" w:sz="4"/>
+              <w:left w:val="single" w:color="8FA6C1" w:sz="4"/>
+              <w:bottom w:val="single" w:color="8FA6C1" w:sz="4"/>
+              <w:right w:val="single" w:color="8FA6C1" w:sz="4"/>
+            </w:tcBorders>
+            <w:tcMar>
+              <w:top w:type="dxa" w:w="60"/>
+              <w:left w:type="dxa" w:w="80"/>
+              <w:bottom w:type="dxa" w:w="60"/>
+              <w:right w:type="dxa" w:w="80"/>
+            </w:tcMar>
+            <w:vAlign w:val="top"/>
+          </w:tcPr>
+          <w:p>
+            <w:r>
+              <w:rPr>
+                <w:rFonts w:ascii="Arial" w:cs="Arial" w:eastAsia="Arial" w:hAnsi="Arial"/>
+                <w:sz w:val="18"/>
+                <w:szCs w:val="18"/>
+              </w:rPr>
+              <w:t xml:space="preserve"/>
+            </w:r>
+          </w:p>
+        </w:tc>
+        <w:tc>
+          <w:tcPr>
+            <w:tcW w:type="dxa" w:w="1700"/>
+            <w:tcBorders>
+              <w:top w:val="single" w:color="8FA6C1" w:sz="4"/>
+              <w:left w:val="single" w:color="8FA6C1" w:sz="4"/>
+              <w:bottom w:val="single" w:color="8FA6C1" w:sz="4"/>
+              <w:right w:val="single" w:color="8FA6C1" w:sz="4"/>
+            </w:tcBorders>
+            <w:tcMar>
+              <w:top w:type="dxa" w:w="60"/>
+              <w:left w:type="dxa" w:w="80"/>
+              <w:bottom w:type="dxa" w:w="60"/>
+              <w:right w:type="dxa" w:w="80"/>
+            </w:tcMar>
+            <w:vAlign w:val="top"/>
+          </w:tcPr>
+          <w:p>
+            <w:r>
+              <w:rPr>
+                <w:rFonts w:ascii="Arial" w:cs="Arial" w:eastAsia="Arial" w:hAnsi="Arial"/>
+                <w:sz w:val="18"/>
+                <w:szCs w:val="18"/>
+              </w:rPr>
+              <w:t xml:space="preserve"/>
+            </w:r>
+          </w:p>
+        </w:tc>
+        <w:tc>
+          <w:tcPr>
+            <w:tcW w:type="dxa" w:w="1700"/>
             <w:tcBorders>
               <w:top w:val="single" w:color="8FA6C1" w:sz="4"/>
               <w:left w:val="single" w:color="8FA6C1" w:sz="4"/>
@@ -1686,7 +1539,7 @@
                 <w:sz w:val="18"/>
                 <w:szCs w:val="18"/>
               </w:rPr>
-              <w:t xml:space="preserve">The citator and the result</w:t>
+              <w:t xml:space="preserve">The citator and the result (see below)</w:t>
             </w:r>
           </w:p>
         </w:tc>
@@ -1717,7 +1570,7 @@
                 <w:sz w:val="18"/>
                 <w:szCs w:val="18"/>
               </w:rPr>
-              <w:t xml:space="preserve">Any notes on the validation (see below)</w:t>
+              <w:t xml:space="preserve">Any notes about the authority (optional)</w:t>
             </w:r>
           </w:p>
         </w:tc>
@@ -2116,7 +1969,7 @@
           <w:sz w:val="20"/>
           <w:szCs w:val="20"/>
         </w:rPr>
-        <w:t xml:space="preserve">Name the citator: KeyCite (Westlaw), Shepard’s (Lexis), BCite (Bloomberg Law), more than one citator, or not validated with a citator. Then give the result: no negative treatment; some negative treatment, but the authority remains good law for your proposition; negative treatment that may affect your proposition; other history, such as a pending appeal or a later amendment; or other.</w:t>
+        <w:t xml:space="preserve">Name the citator: KeyCite (Westlaw), Shepard’s (Lexis), BCite (Bloomberg Law), more than one citator, or not validated with a citator. Then give the result: no negative treatment; some negative treatment, but the authority remains good law for your proposition; negative treatment that may affect your proposition; other history, such as a pending appeal or a later amendment; or other. If you gave “other” as the result, or if you did not use a citator, explain why in this column. A secondary source, for example, usually has no citator entry.</w:t>
       </w:r>
     </w:p>
     <w:p>
@@ -2144,7 +1997,7 @@
           <w:sz w:val="20"/>
           <w:szCs w:val="20"/>
         </w:rPr>
-        <w:t xml:space="preserve">Notes are optional, except in two situations. If you gave “other” as the result, or if you did not use a citator, explain why in the Notes column. A secondary source, for example, usually has no citator entry. You may also name the flag or signal, the later case that caused it, and why the authority still supports your proposition.</w:t>
+        <w:t xml:space="preserve">Use this column for any other notes about the authority, for example, how you plan to use it or a question that you still have about it. Notes are optional.</w:t>
       </w:r>
     </w:p>
     <w:sectPr>

</xml_diff>

<commit_message>
Simplify the Step 7 validation instructions
The Step 7 template and sample card now explain only how to fill in the
Validation column.

Co-Authored-By: Claude Opus 5.5 <noreply@anthropic.com>
Claude-Session: https://claude.ai/code/session_01G8g4FwHzYQhMXKhFfWqCNn
</commit_message>
<xml_diff>
--- a/materials/files/Step7_AuthorityTable_Template.docx
+++ b/materials/files/Step7_AuthorityTable_Template.docx
@@ -1928,7 +1928,7 @@
         <w:keepNext/>
       </w:pPr>
       <w:r>
-        <w:t xml:space="preserve">How to Fill In the Validation and Notes Columns</w:t>
+        <w:t xml:space="preserve">How to Fill In the Validation Column</w:t>
       </w:r>
     </w:p>
     <w:p>
@@ -1941,7 +1941,7 @@
           <w:sz w:val="20"/>
           <w:szCs w:val="20"/>
         </w:rPr>
-        <w:t xml:space="preserve">Validate every case, and every statute, court rule, constitutional provision, or regulation, with a citator.</w:t>
+        <w:t xml:space="preserve">Validate every case, and every statute, court rule, constitutional provision, or regulation, with a citator. In the Validation column, record two things:</w:t>
       </w:r>
     </w:p>
     <w:p>
@@ -1961,7 +1961,7 @@
           <w:sz w:val="20"/>
           <w:szCs w:val="20"/>
         </w:rPr>
-        <w:t xml:space="preserve">Validation: </w:t>
+        <w:t xml:space="preserve">Citator: </w:t>
       </w:r>
       <w:r>
         <w:rPr>
@@ -1969,7 +1969,7 @@
           <w:sz w:val="20"/>
           <w:szCs w:val="20"/>
         </w:rPr>
-        <w:t xml:space="preserve">Name the citator: KeyCite (Westlaw), Shepard’s (Lexis), BCite (Bloomberg Law), more than one citator, or not validated with a citator. Then give the result: no negative treatment; some negative treatment, but the authority remains good law for your proposition; negative treatment that may affect your proposition; other history, such as a pending appeal or a later amendment; or other. If you gave “other” as the result, or if you did not use a citator, explain why in this column. A secondary source, for example, usually has no citator entry.</w:t>
+        <w:t xml:space="preserve">KeyCite (Westlaw), Shepard’s (Lexis), BCite (Bloomberg Law), more than one citator, or not validated with a citator.</w:t>
       </w:r>
     </w:p>
     <w:p>
@@ -1989,7 +1989,7 @@
           <w:sz w:val="20"/>
           <w:szCs w:val="20"/>
         </w:rPr>
-        <w:t xml:space="preserve">Notes: </w:t>
+        <w:t xml:space="preserve">Result: </w:t>
       </w:r>
       <w:r>
         <w:rPr>
@@ -1997,7 +1997,20 @@
           <w:sz w:val="20"/>
           <w:szCs w:val="20"/>
         </w:rPr>
-        <w:t xml:space="preserve">Use this column for any other notes about the authority, for example, how you plan to use it or a question that you still have about it. Notes are optional.</w:t>
+        <w:t xml:space="preserve">No negative treatment; some negative treatment, but the authority remains good law for your proposition; negative treatment that may affect your proposition; other history, such as a pending appeal or a later amendment; or other.</w:t>
+      </w:r>
+    </w:p>
+    <w:p>
+      <w:pPr>
+        <w:spacing w:after="120" w:before="80"/>
+      </w:pPr>
+      <w:r>
+        <w:rPr>
+          <w:rFonts w:ascii="Arial" w:cs="Arial" w:eastAsia="Arial" w:hAnsi="Arial"/>
+          <w:sz w:val="20"/>
+          <w:szCs w:val="20"/>
+        </w:rPr>
+        <w:t xml:space="preserve">If you gave “other” as the result, or if you did not use a citator, explain why in the Validation column. A secondary source, for example, usually has no citator entry.</w:t>
       </w:r>
     </w:p>
     <w:sectPr>

</xml_diff>

<commit_message>
Add the course header to the Step 7 Word template
Co-Authored-By: Claude Opus 5.5 <noreply@anthropic.com>
Claude-Session: https://claude.ai/code/session_01G8g4FwHzYQhMXKhFfWqCNn
</commit_message>
<xml_diff>
--- a/materials/files/Step7_AuthorityTable_Template.docx
+++ b/materials/files/Step7_AuthorityTable_Template.docx
@@ -2014,6 +2014,7 @@
       </w:r>
     </w:p>
     <w:sectPr>
+      <w:headerReference w:type="default" r:id="rId7"/>
       <w:pgSz w:w="15840" w:h="12240" w:orient="landscape"/>
       <w:pgMar w:top="720" w:right="720" w:bottom="720" w:left="720" w:header="708" w:footer="708" w:gutter="0"/>
       <w:pgNumType/>
@@ -2099,6 +2100,66 @@
     </w:p>
   </w:footnote>
 </w:footnotes>
+</file>
+
+<file path=word/header1.xml><?xml version="1.0" encoding="utf-8"?>
+<w:hdr xmlns:wpc="http://schemas.microsoft.com/office/word/2010/wordprocessingCanvas" xmlns:mc="http://schemas.openxmlformats.org/markup-compatibility/2006" xmlns:o="urn:schemas-microsoft-com:office:office" xmlns:r="http://schemas.openxmlformats.org/officeDocument/2006/relationships" xmlns:m="http://schemas.openxmlformats.org/officeDocument/2006/math" xmlns:v="urn:schemas-microsoft-com:vml" xmlns:wp14="http://schemas.microsoft.com/office/word/2010/wordprocessingDrawing" xmlns:wp="http://schemas.openxmlformats.org/drawingml/2006/wordprocessingDrawing" xmlns:w10="urn:schemas-microsoft-com:office:word" xmlns:w="http://schemas.openxmlformats.org/wordprocessingml/2006/main" xmlns:w14="http://schemas.microsoft.com/office/word/2010/wordml" xmlns:w15="http://schemas.microsoft.com/office/word/2012/wordml" xmlns:wpg="http://schemas.microsoft.com/office/word/2010/wordprocessingGroup" xmlns:wpi="http://schemas.microsoft.com/office/word/2010/wordprocessingInk" xmlns:wne="http://schemas.microsoft.com/office/word/2006/wordml" xmlns:wps="http://schemas.microsoft.com/office/word/2010/wordprocessingShape" xmlns:cx="http://schemas.microsoft.com/office/drawing/2014/chartex" xmlns:cx1="http://schemas.microsoft.com/office/drawing/2015/9/8/chartex" xmlns:cx2="http://schemas.microsoft.com/office/drawing/2015/10/21/chartex" xmlns:cx3="http://schemas.microsoft.com/office/drawing/2016/5/9/chartex" xmlns:cx4="http://schemas.microsoft.com/office/drawing/2016/5/10/chartex" xmlns:cx5="http://schemas.microsoft.com/office/drawing/2016/5/11/chartex" xmlns:cx6="http://schemas.microsoft.com/office/drawing/2016/5/12/chartex" xmlns:cx7="http://schemas.microsoft.com/office/drawing/2016/5/13/chartex" xmlns:cx8="http://schemas.microsoft.com/office/drawing/2016/5/14/chartex" xmlns:w16cid="http://schemas.microsoft.com/office/word/2016/wordml/cid" xmlns:w16se="http://schemas.microsoft.com/office/word/2015/wordml/symex">
+  <w:p>
+    <w:pPr>
+      <w:tabs>
+        <w:tab w:val="right" w:pos="14400"/>
+      </w:tabs>
+    </w:pPr>
+    <w:r>
+      <w:rPr>
+        <w:rFonts w:ascii="Arial" w:cs="Arial" w:eastAsia="Arial" w:hAnsi="Arial"/>
+        <w:b/>
+        <w:bCs/>
+        <w:color w:val="001E44"/>
+        <w:sz w:val="20"/>
+        <w:szCs w:val="20"/>
+      </w:rPr>
+      <w:t xml:space="preserve">AI and Legal Research</w:t>
+    </w:r>
+    <w:r>
+      <w:rPr>
+        <w:rFonts w:ascii="Arial" w:cs="Arial" w:eastAsia="Arial" w:hAnsi="Arial"/>
+        <w:color w:val="001E44"/>
+        <w:sz w:val="20"/>
+        <w:szCs w:val="20"/>
+      </w:rPr>
+      <w:t xml:space="preserve">	Fall 2026</w:t>
+    </w:r>
+  </w:p>
+  <w:p>
+    <w:pPr>
+      <w:pBdr>
+        <w:bottom w:val="single" w:color="1E407C" w:sz="6" w:space="4"/>
+      </w:pBdr>
+      <w:tabs>
+        <w:tab w:val="right" w:pos="14400"/>
+      </w:tabs>
+    </w:pPr>
+    <w:r>
+      <w:rPr>
+        <w:rFonts w:ascii="Arial" w:cs="Arial" w:eastAsia="Arial" w:hAnsi="Arial"/>
+        <w:color w:val="001E44"/>
+        <w:sz w:val="20"/>
+        <w:szCs w:val="20"/>
+      </w:rPr>
+      <w:t xml:space="preserve">Professor Crane</w:t>
+    </w:r>
+    <w:r>
+      <w:rPr>
+        <w:rFonts w:ascii="Arial" w:cs="Arial" w:eastAsia="Arial" w:hAnsi="Arial"/>
+        <w:color w:val="001E44"/>
+        <w:sz w:val="20"/>
+        <w:szCs w:val="20"/>
+      </w:rPr>
+      <w:t xml:space="preserve">	Final Capstone Project: Step 7 Authority Table</w:t>
+    </w:r>
+  </w:p>
+</w:hdr>
 </file>
 
 <file path=word/numbering.xml><?xml version="1.0" encoding="utf-8"?>

</xml_diff>

<commit_message>
Step 7: use (1238) as the pincite example everywhere
Change the Table 1 language-column example from "(at 1238)" to "(1238)"
on the sample Step 7 card. In the Step 7 Word template, use the same
example in the instructions and in the Table 1 sample row, and say
"include its pincite (page or paragraph)" to match the card.

Co-Authored-By: Claude Opus 5.5 <noreply@anthropic.com>
Claude-Session: https://claude.ai/code/session_01K7WPS1GQCxfAiyggMpL3Eu
</commit_message>
<xml_diff>
--- a/materials/files/Step7_AuthorityTable_Template.docx
+++ b/materials/files/Step7_AuthorityTable_Template.docx
@@ -92,7 +92,7 @@
           <w:sz w:val="20"/>
           <w:szCs w:val="20"/>
         </w:rPr>
-        <w:t xml:space="preserve">In the language column of Table 1, you may list more than one passage. Put each passage in its own bullet. At the end of each quoted or paraphrased passage, put its pincite (the page or paragraph) in parentheses, for example (at 1238). Then explain briefly why you would quote or paraphrase the passage.</w:t>
+        <w:t xml:space="preserve">In the language column of Table 1, you may list more than one passage. Put each passage in its own bullet. At the end of each quoted or paraphrased passage, include its pincite (page or paragraph) in parentheses, for example (1238). Then explain briefly why you would quote or paraphrase the passage.</w:t>
       </w:r>
     </w:p>
     <w:p>
@@ -598,7 +598,7 @@
                 <w:sz w:val="18"/>
                 <w:szCs w:val="18"/>
               </w:rPr>
-              <w:t xml:space="preserve">First passage that you would quote or paraphrase, with its pincite in parentheses at the end, for example (at 1238), and why it helps your analysis</w:t>
+              <w:t xml:space="preserve">First passage that you would quote or paraphrase, with its pincite in parentheses at the end, for example (1238), and why it helps your analysis</w:t>
             </w:r>
           </w:p>
           <w:p>

</xml_diff>